<commit_message>
Revise aroma formation section for processing scope
Co-authored-by: arena-agent <297053741+arena-agent@users.noreply.github.com>
</commit_message>
<xml_diff>
--- a/Section_2_Research_Status.docx
+++ b/Section_2_Research_Status.docx
@@ -287,7 +287,7 @@
         <w:pStyle w:val="Heading2"/>
       </w:pPr>
       <w:r>
-        <w:t>2.3.2 Formation mechanisms during fermentation</w:t>
+        <w:t>2.3.2 Formation mechanisms across processing stages</w:t>
       </w:r>
     </w:p>
     <w:p>
@@ -295,7 +295,7 @@
         <w:widowControl/>
       </w:pPr>
       <w:r>
-        <w:t>The aroma of fermented vegetables has at least two broad sources. Some compounds are present in raw vegetables, spices, and seasonings or are released from their precursors by plant enzymes. Others form through microbial or chemical transformation during salting, fermentation, storage, and cooking. In cruciferous vegetables, myrosinase-mediated hydrolysis of glucosinolates can generate isothiocyanates, nitriles, and related products. Their formation depends on substrate composition, enzyme activity, pH, tissue disruption, and the subsequent chemical and microbial environment. Garlic and onion contribute a separate sulfur chemistry in which tissue disruption activates alliinase and produces reactive sulfur intermediates. These plant-derived pathways can be altered by blanching, salting, drying, or heating before or after fermentation [Xiao et al., 2010] [Zhang et al., 2026] [Ref].</w:t>
+        <w:t>Aroma compounds in fermented vegetables originate from two primary sources: natural plant pathways activated during tissue preparation, and chemical and microbial transformations occurring during salting, fermentation, storage, and cooking. In cruciferous vegetables, chopping ruptures cells and allows the enzyme myrosinase to hydrolyze glucosinolates into pungent isothiocyanates and nitriles. In garlic and allium seasonings, cellular damage activates alliinase, initiating the rapid synthesis of reactive sulfur intermediates. These initial enzymatic cascades can be modified or arrested by salting, sun wilting, blanching, and subsequent brine acidification [Xiao et al., 2010] [Zhang et al., 2026] [Ref].</w:t>
       </w:r>
     </w:p>
     <w:p>
@@ -303,7 +303,7 @@
         <w:widowControl/>
       </w:pPr>
       <w:r>
-        <w:t>Microbial carbohydrate metabolism supplies alcohols, acids, carbon dioxide, and aroma precursors. Homofermentative lactic acid bacteria primarily produce lactate from hexoses. Heterofermentative bacteria can generate lactate with acetate or ethanol, while yeast metabolism can contribute ethanol, higher alcohols, and esters. Pyruvate metabolism may form acetoin and diacetyl. The balance between these products reflects substrate availability, oxygen, pH, temperature, and interactions among bacteria and yeasts. During fermentation of pickled and dried mustard, microbial succession was associated with dynamic changes in organic acids, free amino acids, and volatile compounds. Studies of paocai and other pickles similarly link community composition with product-specific volatile profiles [Xiao et al., 2020] [Zhao et al., 2021] [Jiang et al., 2026].</w:t>
+        <w:t>Microbial carbohydrate metabolism supplies alcohols, short-chain acids, and aroma precursors. Homofermentative lactic acid bacteria produce mainly non-volatile lactate, while heterofermentative bacteria and fermentative yeasts generate ethanol, higher alcohols, acetate, and carbon dioxide. Excess pyruvate can be channeled into diacetyl and acetoin synthesis, contributing buttery undertones. Microbial community succession drives dynamic changes in these volatiles; early salt-tolerant species are gradually replaced by acid-tolerant lactic acid bacteria, causing fruity and fresh aromas to transition into mature, acidic, and fermented notes [Xiao et al., 2020] [Zhao et al., 2021] [Jiang et al., 2026].</w:t>
       </w:r>
     </w:p>
     <w:p>
@@ -311,7 +311,7 @@
         <w:widowControl/>
       </w:pPr>
       <w:r>
-        <w:t>Amino-acid catabolism is an important route to aldehydes, alcohols, acids, and sulfur volatiles. In the Ehrlich pathway, an amino acid is transaminated to an alpha-keto acid, decarboxylated to an aldehyde, and then reduced to a higher alcohol or oxidized to a carboxylic acid. Branched-chain amino acids can yield branched aldehydes and alcohols, while phenylalanine can yield phenylacetaldehyde and 2-phenylethanol. Methionine and cysteine metabolism can contribute sulfur-containing aroma compounds. Protein hydrolysis therefore changes gustatory amino-acid composition while also supplying precursors for aroma formation [Sun et al., 2023] [Zhang et al., 2026] [Ref].</w:t>
+        <w:t>Amino acid catabolism provides an important secondary pathway for volatile production. Through the microbial Ehrlich pathway, amino acids undergo transamination into alpha-keto acids, followed by decarboxylation into aldehydes and subsequent reduction into higher alcohols or oxidation into volatile acids. In this manner, phenylalanine is transformed into floral phenylacetaldehyde and 2-phenylethanol, branched-chain amino acids form branched alcohols and esters, and methionine catabolism releases potent sulfur volatiles. Concurrently, plant lipases release free fatty acids that undergo enzymatic or chemical oxidation to yield aldehydes, alcohols, and ketones. Microbial esterases then synthesize fruity ethyl esters from available alcohols and organic acids [Sun et al., 2023] [Chen et al., 2026] [Zhang et al., 2026].</w:t>
       </w:r>
     </w:p>
     <w:p>
@@ -319,23 +319,7 @@
         <w:widowControl/>
       </w:pPr>
       <w:r>
-        <w:t>Lipid hydrolysis and oxidation generate additional volatile families. Plant lipases release free fatty acids, and oxidation of unsaturated fatty acids through lipoxygenase-dependent or nonenzymatic routes produces hydroperoxides. Their cleavage can yield aldehydes, alcohols, ketones, and hydrocarbons, including green and fatty odorants. Microbial reduction or oxidation can further convert aldehydes into alcohols or acids. Ester formation then occurs through microbial esterases or related acyl-transfer reactions involving alcohols and acyl donors. The presence of ethyl lactate and other ethyl esters in fermented vegetables illustrates how acid and alcohol metabolism can converge on fruity, sweet, or solvent-like aroma notes [Sun et al., 2023] [Chen et al., 2026] [Ref].</w:t>
-      </w:r>
-    </w:p>
-    <w:p>
-      <w:pPr>
-        <w:widowControl/>
-      </w:pPr>
-      <w:r>
-        <w:t>Community succession helps explain why aroma profiles vary over time. Early populations may include plant-associated and salt-tolerant organisms, followed by lactic acid bacteria that thrive as acidification proceeds. Yeasts and other bacteria may persist or become important depending on oxygen exposure, salt, and fermentation conditions. Correlation networks can identify candidate taxa associated with specific metabolites, and culture-based isolation can test metabolic capacity. Such associations alone do not establish that a taxon produced a volatile in situ. Stronger mechanistic evidence comes from controlled inoculation, defined consortia, isotope tracing, transcript or enzyme measurements, and metabolite verification in a suitable food matrix [Xiao et al., 2020] [Tang et al., 2024] [Zhang et al., 2026].</w:t>
-      </w:r>
-    </w:p>
-    <w:p>
-      <w:pPr>
-        <w:widowControl/>
-      </w:pPr>
-      <w:r>
-        <w:t>Cooking creates a second set of aroma transformations that can dominate the served dish. Heat can volatilize or degrade fermentation-derived compounds, disrupt cells and release bound compounds, promote oxidation, and shift the partition of odorants between water, oil, and headspace. Stir-frying at high temperature can support Maillard and Strecker chemistry, producing pyrazines, furans, and aldehydes, while boiling can leach water-soluble constituents and volatile compounds into the cooking liquid. Lipid-rich cooking media can retain hydrophobic odorants and alter their release during consumption. Consequently, the aroma of the uncooked fermented ingredient cannot be assumed to predict the aroma of a cooked composite vegetable dish [Shen et al., 2019] [Li et al., 2023] [Ref].</w:t>
+        <w:t>Cooking introduces a final, decisive stage of aroma transformation. Thermal processing volatilizes light sulfur compounds, degrades delicate fermentation products, and releases cell-bound volatiles. High-temperature stir-frying promotes Maillard and Strecker reactions between reducing sugars and amino acids, generating savory pyrazines, furans, and roasted aldehydes. Furthermore, adding cooking oil creates a lipid phase that traps hydrophobic aroma compounds and alters their release during chewing. Because of these intense heat-induced reactions, the volatile profile of the uncooked fermented vegetable cannot be assumed to predict the aroma of the final cooked dish [Shen et al., 2019] [Li et al., 2023].</w:t>
       </w:r>
     </w:p>
     <w:p>

</xml_diff>